<commit_message>
Update commissioner outreach materials with brand colours and verified scope
Rebuild the one-pager using the actual brand palette (teal/navy/coral)
and correct the service model, inclusion/exclusion criteria and
accessibility statement to match the official source documents
(national remote + occasional Essex in-person; AIS/Equality Act 2010
compliance; precise inclusion/exclusion wording). Update the email to
match the corrected service model.

Co-Authored-By: Claude Sonnet 5 <noreply@anthropic.com>
Claude-Session: https://claude.ai/code/session_01Uqa3eyCJ5qv5EL35vZVRqm
</commit_message>
<xml_diff>
--- a/commissioner-outreach/Allergy-Nurture-Nurses-At-A-Glance.docx
+++ b/commissioner-outreach/Allergy-Nurture-Nurses-At-A-Glance.docx
@@ -10,7 +10,7 @@
         <w:rPr>
           <w:b/>
           <w:bCs/>
-          <w:color w:val="1c3a5e"/>
+          <w:color w:val="0A3437"/>
           <w:sz w:val="40"/>
           <w:szCs w:val="40"/>
         </w:rPr>
@@ -29,7 +29,7 @@
           <w:sz w:val="20"/>
           <w:szCs w:val="20"/>
         </w:rPr>
-        <w:t xml:space="preserve">CQC-registered, nurse-led remote allergy and asthma advisory service for children, young people and families</w:t>
+        <w:t xml:space="preserve">CQC-registered, nurse-led national allergy and asthma advisory service for children, young people and families</w:t>
       </w:r>
     </w:p>
     <w:tbl>
@@ -52,26 +52,26 @@
         <w:tc>
           <w:tcPr>
             <w:tcW w:type="dxa" w:w="2600"/>
-            <w:shd w:fill="eaf1fb" w:color="auto" w:val="clear"/>
-            <w:tcMar>
-              <w:top w:type="dxa" w:w="100"/>
-              <w:left w:type="dxa" w:w="120"/>
-              <w:bottom w:type="dxa" w:w="100"/>
-              <w:right w:type="dxa" w:w="120"/>
-            </w:tcMar>
-            <w:vAlign w:val="center"/>
-          </w:tcPr>
-          <w:p>
-            <w:pPr>
-              <w:jc w:val="left"/>
-            </w:pPr>
-            <w:r>
-              <w:rPr>
-                <w:b/>
-                <w:bCs/>
-                <w:i w:val="false"/>
-                <w:iCs w:val="false"/>
-                <w:color w:val="1c3a5e"/>
+            <w:shd w:fill="E3F1F1" w:color="auto" w:val="clear"/>
+            <w:tcMar>
+              <w:top w:type="dxa" w:w="100"/>
+              <w:left w:type="dxa" w:w="120"/>
+              <w:bottom w:type="dxa" w:w="100"/>
+              <w:right w:type="dxa" w:w="120"/>
+            </w:tcMar>
+            <w:vAlign w:val="center"/>
+          </w:tcPr>
+          <w:p>
+            <w:pPr>
+              <w:jc w:val="left"/>
+            </w:pPr>
+            <w:r>
+              <w:rPr>
+                <w:b/>
+                <w:bCs/>
+                <w:i w:val="false"/>
+                <w:iCs w:val="false"/>
+                <w:color w:val="0A3437"/>
                 <w:sz w:val="19"/>
                 <w:szCs w:val="19"/>
               </w:rPr>
@@ -104,7 +104,7 @@
                 <w:sz w:val="19"/>
                 <w:szCs w:val="19"/>
               </w:rPr>
-              <w:t xml:space="preserve">CQC-registered, nurse-led remote allergy and asthma advisory service for children, young people and families.</w:t>
+              <w:t xml:space="preserve">CQC-registered, nurse-led national remote/virtual allergy advisory service for children, young people and families, with occasional Essex-based in-person consultations where required, in a secure, risk-assessed setting.</w:t>
             </w:r>
           </w:p>
         </w:tc>
@@ -113,26 +113,26 @@
         <w:tc>
           <w:tcPr>
             <w:tcW w:type="dxa" w:w="2600"/>
-            <w:shd w:fill="eaf1fb" w:color="auto" w:val="clear"/>
-            <w:tcMar>
-              <w:top w:type="dxa" w:w="100"/>
-              <w:left w:type="dxa" w:w="120"/>
-              <w:bottom w:type="dxa" w:w="100"/>
-              <w:right w:type="dxa" w:w="120"/>
-            </w:tcMar>
-            <w:vAlign w:val="center"/>
-          </w:tcPr>
-          <w:p>
-            <w:pPr>
-              <w:jc w:val="left"/>
-            </w:pPr>
-            <w:r>
-              <w:rPr>
-                <w:b/>
-                <w:bCs/>
-                <w:i w:val="false"/>
-                <w:iCs w:val="false"/>
-                <w:color w:val="1c3a5e"/>
+            <w:shd w:fill="E3F1F1" w:color="auto" w:val="clear"/>
+            <w:tcMar>
+              <w:top w:type="dxa" w:w="100"/>
+              <w:left w:type="dxa" w:w="120"/>
+              <w:bottom w:type="dxa" w:w="100"/>
+              <w:right w:type="dxa" w:w="120"/>
+            </w:tcMar>
+            <w:vAlign w:val="center"/>
+          </w:tcPr>
+          <w:p>
+            <w:pPr>
+              <w:jc w:val="left"/>
+            </w:pPr>
+            <w:r>
+              <w:rPr>
+                <w:b/>
+                <w:bCs/>
+                <w:i w:val="false"/>
+                <w:iCs w:val="false"/>
+                <w:color w:val="0A3437"/>
                 <w:sz w:val="19"/>
                 <w:szCs w:val="19"/>
               </w:rPr>
@@ -174,26 +174,26 @@
         <w:tc>
           <w:tcPr>
             <w:tcW w:type="dxa" w:w="2600"/>
-            <w:shd w:fill="eaf1fb" w:color="auto" w:val="clear"/>
-            <w:tcMar>
-              <w:top w:type="dxa" w:w="100"/>
-              <w:left w:type="dxa" w:w="120"/>
-              <w:bottom w:type="dxa" w:w="100"/>
-              <w:right w:type="dxa" w:w="120"/>
-            </w:tcMar>
-            <w:vAlign w:val="center"/>
-          </w:tcPr>
-          <w:p>
-            <w:pPr>
-              <w:jc w:val="left"/>
-            </w:pPr>
-            <w:r>
-              <w:rPr>
-                <w:b/>
-                <w:bCs/>
-                <w:i w:val="false"/>
-                <w:iCs w:val="false"/>
-                <w:color w:val="1c3a5e"/>
+            <w:shd w:fill="E3F1F1" w:color="auto" w:val="clear"/>
+            <w:tcMar>
+              <w:top w:type="dxa" w:w="100"/>
+              <w:left w:type="dxa" w:w="120"/>
+              <w:bottom w:type="dxa" w:w="100"/>
+              <w:right w:type="dxa" w:w="120"/>
+            </w:tcMar>
+            <w:vAlign w:val="center"/>
+          </w:tcPr>
+          <w:p>
+            <w:pPr>
+              <w:jc w:val="left"/>
+            </w:pPr>
+            <w:r>
+              <w:rPr>
+                <w:b/>
+                <w:bCs/>
+                <w:i w:val="false"/>
+                <w:iCs w:val="false"/>
+                <w:color w:val="0A3437"/>
                 <w:sz w:val="19"/>
                 <w:szCs w:val="19"/>
               </w:rPr>
@@ -226,7 +226,7 @@
                 <w:sz w:val="19"/>
                 <w:szCs w:val="19"/>
               </w:rPr>
-              <w:t xml:space="preserve">Non-IgE food allergy, eczema, allergic rhinitis, allergy-related respiratory/asthma awareness, feeding concerns and food introduction.</w:t>
+              <w:t xml:space="preserve">Non-IgE food allergy, eczema with possible allergic triggers, allergic rhinitis, infant feeding concerns (e.g. reflux, colic, constipation where allergy is suspected), and mild-to-moderate allergic symptoms.</w:t>
             </w:r>
           </w:p>
         </w:tc>
@@ -235,26 +235,26 @@
         <w:tc>
           <w:tcPr>
             <w:tcW w:type="dxa" w:w="2600"/>
-            <w:shd w:fill="eaf1fb" w:color="auto" w:val="clear"/>
-            <w:tcMar>
-              <w:top w:type="dxa" w:w="100"/>
-              <w:left w:type="dxa" w:w="120"/>
-              <w:bottom w:type="dxa" w:w="100"/>
-              <w:right w:type="dxa" w:w="120"/>
-            </w:tcMar>
-            <w:vAlign w:val="center"/>
-          </w:tcPr>
-          <w:p>
-            <w:pPr>
-              <w:jc w:val="left"/>
-            </w:pPr>
-            <w:r>
-              <w:rPr>
-                <w:b/>
-                <w:bCs/>
-                <w:i w:val="false"/>
-                <w:iCs w:val="false"/>
-                <w:color w:val="1c3a5e"/>
+            <w:shd w:fill="E3F1F1" w:color="auto" w:val="clear"/>
+            <w:tcMar>
+              <w:top w:type="dxa" w:w="100"/>
+              <w:left w:type="dxa" w:w="120"/>
+              <w:bottom w:type="dxa" w:w="100"/>
+              <w:right w:type="dxa" w:w="120"/>
+            </w:tcMar>
+            <w:vAlign w:val="center"/>
+          </w:tcPr>
+          <w:p>
+            <w:pPr>
+              <w:jc w:val="left"/>
+            </w:pPr>
+            <w:r>
+              <w:rPr>
+                <w:b/>
+                <w:bCs/>
+                <w:i w:val="false"/>
+                <w:iCs w:val="false"/>
+                <w:color w:val="0A3437"/>
                 <w:sz w:val="19"/>
                 <w:szCs w:val="19"/>
               </w:rPr>
@@ -287,7 +287,7 @@
                 <w:sz w:val="19"/>
                 <w:szCs w:val="19"/>
               </w:rPr>
-              <w:t xml:space="preserve">Timely education, support, safety-netting and signposting for families — complementing existing NHS and community pathways, not replacing them.</w:t>
+              <w:t xml:space="preserve">Timely, evidence-based education, support, safety-netting and signposting for families — complementing existing NHS and community pathways, not replacing them.</w:t>
             </w:r>
           </w:p>
         </w:tc>
@@ -296,26 +296,26 @@
         <w:tc>
           <w:tcPr>
             <w:tcW w:type="dxa" w:w="2600"/>
-            <w:shd w:fill="eaf1fb" w:color="auto" w:val="clear"/>
-            <w:tcMar>
-              <w:top w:type="dxa" w:w="100"/>
-              <w:left w:type="dxa" w:w="120"/>
-              <w:bottom w:type="dxa" w:w="100"/>
-              <w:right w:type="dxa" w:w="120"/>
-            </w:tcMar>
-            <w:vAlign w:val="center"/>
-          </w:tcPr>
-          <w:p>
-            <w:pPr>
-              <w:jc w:val="left"/>
-            </w:pPr>
-            <w:r>
-              <w:rPr>
-                <w:b/>
-                <w:bCs/>
-                <w:i w:val="false"/>
-                <w:iCs w:val="false"/>
-                <w:color w:val="1c3a5e"/>
+            <w:shd w:fill="E3F1F1" w:color="auto" w:val="clear"/>
+            <w:tcMar>
+              <w:top w:type="dxa" w:w="100"/>
+              <w:left w:type="dxa" w:w="120"/>
+              <w:bottom w:type="dxa" w:w="100"/>
+              <w:right w:type="dxa" w:w="120"/>
+            </w:tcMar>
+            <w:vAlign w:val="center"/>
+          </w:tcPr>
+          <w:p>
+            <w:pPr>
+              <w:jc w:val="left"/>
+            </w:pPr>
+            <w:r>
+              <w:rPr>
+                <w:b/>
+                <w:bCs/>
+                <w:i w:val="false"/>
+                <w:iCs w:val="false"/>
+                <w:color w:val="0A3437"/>
                 <w:sz w:val="19"/>
                 <w:szCs w:val="19"/>
               </w:rPr>
@@ -348,7 +348,7 @@
                 <w:sz w:val="19"/>
                 <w:szCs w:val="19"/>
               </w:rPr>
-              <w:t xml:space="preserve">Families seeking non-urgent support to understand allergy-related symptoms, symptom patterns, practical next steps and when to seek further medical review.</w:t>
+              <w:t xml:space="preserve">Children, young people (0–17) and families with mild-to-moderate suspected or diagnosed allergic conditions who would benefit from a detailed history, education, and advice on elimination/reintroduction and next steps.</w:t>
             </w:r>
           </w:p>
         </w:tc>
@@ -357,26 +357,26 @@
         <w:tc>
           <w:tcPr>
             <w:tcW w:type="dxa" w:w="2600"/>
-            <w:shd w:fill="eaf1fb" w:color="auto" w:val="clear"/>
-            <w:tcMar>
-              <w:top w:type="dxa" w:w="100"/>
-              <w:left w:type="dxa" w:w="120"/>
-              <w:bottom w:type="dxa" w:w="100"/>
-              <w:right w:type="dxa" w:w="120"/>
-            </w:tcMar>
-            <w:vAlign w:val="center"/>
-          </w:tcPr>
-          <w:p>
-            <w:pPr>
-              <w:jc w:val="left"/>
-            </w:pPr>
-            <w:r>
-              <w:rPr>
-                <w:b/>
-                <w:bCs/>
-                <w:i w:val="false"/>
-                <w:iCs w:val="false"/>
-                <w:color w:val="1c3a5e"/>
+            <w:shd w:fill="E3F1F1" w:color="auto" w:val="clear"/>
+            <w:tcMar>
+              <w:top w:type="dxa" w:w="100"/>
+              <w:left w:type="dxa" w:w="120"/>
+              <w:bottom w:type="dxa" w:w="100"/>
+              <w:right w:type="dxa" w:w="120"/>
+            </w:tcMar>
+            <w:vAlign w:val="center"/>
+          </w:tcPr>
+          <w:p>
+            <w:pPr>
+              <w:jc w:val="left"/>
+            </w:pPr>
+            <w:r>
+              <w:rPr>
+                <w:b/>
+                <w:bCs/>
+                <w:i w:val="false"/>
+                <w:iCs w:val="false"/>
+                <w:color w:val="0A3437"/>
                 <w:sz w:val="19"/>
                 <w:szCs w:val="19"/>
               </w:rPr>
@@ -418,26 +418,26 @@
         <w:tc>
           <w:tcPr>
             <w:tcW w:type="dxa" w:w="2600"/>
-            <w:shd w:fill="eaf1fb" w:color="auto" w:val="clear"/>
-            <w:tcMar>
-              <w:top w:type="dxa" w:w="100"/>
-              <w:left w:type="dxa" w:w="120"/>
-              <w:bottom w:type="dxa" w:w="100"/>
-              <w:right w:type="dxa" w:w="120"/>
-            </w:tcMar>
-            <w:vAlign w:val="center"/>
-          </w:tcPr>
-          <w:p>
-            <w:pPr>
-              <w:jc w:val="left"/>
-            </w:pPr>
-            <w:r>
-              <w:rPr>
-                <w:b/>
-                <w:bCs/>
-                <w:i w:val="false"/>
-                <w:iCs w:val="false"/>
-                <w:color w:val="1c3a5e"/>
+            <w:shd w:fill="E3F1F1" w:color="auto" w:val="clear"/>
+            <w:tcMar>
+              <w:top w:type="dxa" w:w="100"/>
+              <w:left w:type="dxa" w:w="120"/>
+              <w:bottom w:type="dxa" w:w="100"/>
+              <w:right w:type="dxa" w:w="120"/>
+            </w:tcMar>
+            <w:vAlign w:val="center"/>
+          </w:tcPr>
+          <w:p>
+            <w:pPr>
+              <w:jc w:val="left"/>
+            </w:pPr>
+            <w:r>
+              <w:rPr>
+                <w:b/>
+                <w:bCs/>
+                <w:i w:val="false"/>
+                <w:iCs w:val="false"/>
+                <w:color w:val="0A3437"/>
                 <w:sz w:val="19"/>
                 <w:szCs w:val="19"/>
               </w:rPr>
@@ -470,7 +470,7 @@
                 <w:sz w:val="19"/>
                 <w:szCs w:val="19"/>
               </w:rPr>
-              <w:t xml:space="preserve">Diagnosis, prescribing, allergy testing, emergency care, acute asthma/anaphylaxis management, or replacement of GP/NHS/specialist services.</w:t>
+              <w:t xml:space="preserve">Diagnostic allergy testing, prescribing/administration of medicines, or emergency care. Not suitable for known/suspected IgE-mediated food allergy, history of anaphylaxis, or severe/uncontrolled asthma — see Scope of practice.</w:t>
             </w:r>
           </w:p>
         </w:tc>
@@ -479,26 +479,26 @@
         <w:tc>
           <w:tcPr>
             <w:tcW w:type="dxa" w:w="2600"/>
-            <w:shd w:fill="eaf1fb" w:color="auto" w:val="clear"/>
-            <w:tcMar>
-              <w:top w:type="dxa" w:w="100"/>
-              <w:left w:type="dxa" w:w="120"/>
-              <w:bottom w:type="dxa" w:w="100"/>
-              <w:right w:type="dxa" w:w="120"/>
-            </w:tcMar>
-            <w:vAlign w:val="center"/>
-          </w:tcPr>
-          <w:p>
-            <w:pPr>
-              <w:jc w:val="left"/>
-            </w:pPr>
-            <w:r>
-              <w:rPr>
-                <w:b/>
-                <w:bCs/>
-                <w:i w:val="false"/>
-                <w:iCs w:val="false"/>
-                <w:color w:val="1c3a5e"/>
+            <w:shd w:fill="E3F1F1" w:color="auto" w:val="clear"/>
+            <w:tcMar>
+              <w:top w:type="dxa" w:w="100"/>
+              <w:left w:type="dxa" w:w="120"/>
+              <w:bottom w:type="dxa" w:w="100"/>
+              <w:right w:type="dxa" w:w="120"/>
+            </w:tcMar>
+            <w:vAlign w:val="center"/>
+          </w:tcPr>
+          <w:p>
+            <w:pPr>
+              <w:jc w:val="left"/>
+            </w:pPr>
+            <w:r>
+              <w:rPr>
+                <w:b/>
+                <w:bCs/>
+                <w:i w:val="false"/>
+                <w:iCs w:val="false"/>
+                <w:color w:val="0A3437"/>
                 <w:sz w:val="19"/>
                 <w:szCs w:val="19"/>
               </w:rPr>
@@ -540,26 +540,26 @@
         <w:tc>
           <w:tcPr>
             <w:tcW w:type="dxa" w:w="2600"/>
-            <w:shd w:fill="eaf1fb" w:color="auto" w:val="clear"/>
-            <w:tcMar>
-              <w:top w:type="dxa" w:w="100"/>
-              <w:left w:type="dxa" w:w="120"/>
-              <w:bottom w:type="dxa" w:w="100"/>
-              <w:right w:type="dxa" w:w="120"/>
-            </w:tcMar>
-            <w:vAlign w:val="center"/>
-          </w:tcPr>
-          <w:p>
-            <w:pPr>
-              <w:jc w:val="left"/>
-            </w:pPr>
-            <w:r>
-              <w:rPr>
-                <w:b/>
-                <w:bCs/>
-                <w:i w:val="false"/>
-                <w:iCs w:val="false"/>
-                <w:color w:val="1c3a5e"/>
+            <w:shd w:fill="E3F1F1" w:color="auto" w:val="clear"/>
+            <w:tcMar>
+              <w:top w:type="dxa" w:w="100"/>
+              <w:left w:type="dxa" w:w="120"/>
+              <w:bottom w:type="dxa" w:w="100"/>
+              <w:right w:type="dxa" w:w="120"/>
+            </w:tcMar>
+            <w:vAlign w:val="center"/>
+          </w:tcPr>
+          <w:p>
+            <w:pPr>
+              <w:jc w:val="left"/>
+            </w:pPr>
+            <w:r>
+              <w:rPr>
+                <w:b/>
+                <w:bCs/>
+                <w:i w:val="false"/>
+                <w:iCs w:val="false"/>
+                <w:color w:val="0A3437"/>
                 <w:sz w:val="19"/>
                 <w:szCs w:val="19"/>
               </w:rPr>
@@ -592,7 +592,7 @@
                 <w:sz w:val="19"/>
                 <w:szCs w:val="19"/>
               </w:rPr>
-              <w:t xml:space="preserve">Remote, UK-wide support, including for families whose primary language is not English, with communication support considered where appropriate.</w:t>
+              <w:t xml:space="preserve">Compliant with the NHS Accessible Information Standard (DCB1605) and Equality Act 2010 reasonable adjustments — identifying, recording and meeting communication needs, including interpreter services, extra consultation time and written summaries.</w:t>
             </w:r>
           </w:p>
         </w:tc>
@@ -601,7 +601,7 @@
     <w:p>
       <w:pPr>
         <w:pBdr>
-          <w:bottom w:val="single" w:color="2a78d6" w:sz="6" w:space="4"/>
+          <w:bottom w:val="single" w:color="D5624C" w:sz="6" w:space="4"/>
         </w:pBdr>
         <w:spacing w:after="100" w:before="260"/>
       </w:pPr>
@@ -609,7 +609,7 @@
         <w:rPr>
           <w:b/>
           <w:bCs/>
-          <w:color w:val="1c3a5e"/>
+          <w:color w:val="0A3437"/>
           <w:sz w:val="24"/>
           <w:szCs w:val="24"/>
         </w:rPr>
@@ -696,7 +696,7 @@
         <w:tc>
           <w:tcPr>
             <w:tcW w:type="dxa" w:w="3008"/>
-            <w:shd w:fill="f4f4f2" w:color="auto" w:val="clear"/>
+            <w:shd w:fill="F0F7F7" w:color="auto" w:val="clear"/>
             <w:tcMar>
               <w:top w:type="dxa" w:w="160"/>
               <w:left w:type="dxa" w:w="140"/>
@@ -713,7 +713,7 @@
               <w:rPr>
                 <w:b/>
                 <w:bCs/>
-                <w:color w:val="2a78d6"/>
+                <w:color w:val="199195"/>
                 <w:sz w:val="34"/>
                 <w:szCs w:val="34"/>
               </w:rPr>
@@ -737,7 +737,7 @@
         <w:tc>
           <w:tcPr>
             <w:tcW w:type="dxa" w:w="3008"/>
-            <w:shd w:fill="f4f4f2" w:color="auto" w:val="clear"/>
+            <w:shd w:fill="F0F7F7" w:color="auto" w:val="clear"/>
             <w:tcMar>
               <w:top w:type="dxa" w:w="160"/>
               <w:left w:type="dxa" w:w="140"/>
@@ -754,7 +754,7 @@
               <w:rPr>
                 <w:b/>
                 <w:bCs/>
-                <w:color w:val="2a78d6"/>
+                <w:color w:val="199195"/>
                 <w:sz w:val="34"/>
                 <w:szCs w:val="34"/>
               </w:rPr>
@@ -778,7 +778,7 @@
         <w:tc>
           <w:tcPr>
             <w:tcW w:type="dxa" w:w="3010"/>
-            <w:shd w:fill="f4f4f2" w:color="auto" w:val="clear"/>
+            <w:shd w:fill="F0F7F7" w:color="auto" w:val="clear"/>
             <w:tcMar>
               <w:top w:type="dxa" w:w="160"/>
               <w:left w:type="dxa" w:w="140"/>
@@ -795,7 +795,7 @@
               <w:rPr>
                 <w:b/>
                 <w:bCs/>
-                <w:color w:val="2a78d6"/>
+                <w:color w:val="199195"/>
                 <w:sz w:val="34"/>
                 <w:szCs w:val="34"/>
               </w:rPr>
@@ -821,7 +821,7 @@
     <w:p>
       <w:pPr>
         <w:pBdr>
-          <w:bottom w:val="single" w:color="2a78d6" w:sz="6" w:space="4"/>
+          <w:bottom w:val="single" w:color="199195" w:sz="6" w:space="4"/>
         </w:pBdr>
         <w:spacing w:after="100" w:before="260"/>
       </w:pPr>
@@ -829,7 +829,7 @@
         <w:rPr>
           <w:b/>
           <w:bCs/>
-          <w:color w:val="1c3a5e"/>
+          <w:color w:val="0A3437"/>
           <w:sz w:val="24"/>
           <w:szCs w:val="24"/>
         </w:rPr>
@@ -844,7 +844,7 @@
         <w:rPr>
           <w:b/>
           <w:bCs/>
-          <w:color w:val="1c3a5e"/>
+          <w:color w:val="0A3437"/>
           <w:sz w:val="19"/>
           <w:szCs w:val="19"/>
         </w:rPr>
@@ -855,18 +855,18 @@
           <w:sz w:val="19"/>
           <w:szCs w:val="19"/>
         </w:rPr>
-        <w:t xml:space="preserve">non-urgent support for suspected/known Non-IgE food allergy, eczema where allergy may be a factor, allergic rhinitis, allergy-related respiratory/asthma awareness, feeding concerns, food introduction and symptom education.</w:t>
+        <w:t xml:space="preserve">mild-to-moderate suspected/diagnosed Non-IgE food allergy, suspected food-related symptoms requiring assessment, eczema with possible allergic triggers, infant feeding concerns (e.g. reflux, colic, constipation where allergy is suspected), and allergic rhinitis.</w:t>
       </w:r>
     </w:p>
     <w:p>
       <w:pPr>
-        <w:spacing w:after="160"/>
+        <w:spacing w:after="100"/>
       </w:pPr>
       <w:r>
         <w:rPr>
           <w:b/>
           <w:bCs/>
-          <w:color w:val="1c3a5e"/>
+          <w:color w:val="0A3437"/>
           <w:sz w:val="19"/>
           <w:szCs w:val="19"/>
         </w:rPr>
@@ -877,21 +877,43 @@
           <w:sz w:val="19"/>
           <w:szCs w:val="19"/>
         </w:rPr>
-        <w:t xml:space="preserve">any child who is acutely unwell, or has breathing difficulty, symptoms of anaphylaxis, acute asthma symptoms, collapse, severe illness or rapid deterioration — families are directed to call 999 or attend emergency care.</w:t>
+        <w:t xml:space="preserve">known/suspected IgE-mediated food allergy requiring specialist medical management, history of anaphylaxis, severe or uncontrolled asthma, significant respiratory compromise, or any presentation requiring diagnostic testing, prescribing, or urgent/emergency care.</w:t>
       </w:r>
     </w:p>
     <w:p>
       <w:pPr>
-        <w:pBdr>
-          <w:bottom w:val="single" w:color="2a78d6" w:sz="6" w:space="4"/>
-        </w:pBdr>
-        <w:spacing w:after="100" w:before="260"/>
+        <w:spacing w:after="160"/>
       </w:pPr>
       <w:r>
         <w:rPr>
           <w:b/>
           <w:bCs/>
-          <w:color w:val="1c3a5e"/>
+          <w:color w:val="0A3437"/>
+          <w:sz w:val="19"/>
+          <w:szCs w:val="19"/>
+        </w:rPr>
+        <w:t xml:space="preserve">Escalation: </w:t>
+      </w:r>
+      <w:r>
+        <w:rPr>
+          <w:sz w:val="19"/>
+          <w:szCs w:val="19"/>
+        </w:rPr>
+        <w:t xml:space="preserve">families are directed to 999, NHS 111 or their GP as appropriate. With consent, information may be shared with the GP, health visitor, school nursing team, dietitian or other relevant professionals to support coordinated care.</w:t>
+      </w:r>
+    </w:p>
+    <w:p>
+      <w:pPr>
+        <w:pBdr>
+          <w:bottom w:val="single" w:color="199195" w:sz="6" w:space="4"/>
+        </w:pBdr>
+        <w:spacing w:after="100" w:before="260"/>
+      </w:pPr>
+      <w:r>
+        <w:rPr>
+          <w:b/>
+          <w:bCs/>
+          <w:color w:val="0A3437"/>
           <w:sz w:val="24"/>
           <w:szCs w:val="24"/>
         </w:rPr>
@@ -918,26 +940,26 @@
         <w:tc>
           <w:tcPr>
             <w:tcW w:type="dxa" w:w="2200"/>
-            <w:shd w:fill="eaf1fb" w:color="auto" w:val="clear"/>
-            <w:tcMar>
-              <w:top w:type="dxa" w:w="100"/>
-              <w:left w:type="dxa" w:w="120"/>
-              <w:bottom w:type="dxa" w:w="100"/>
-              <w:right w:type="dxa" w:w="120"/>
-            </w:tcMar>
-            <w:vAlign w:val="center"/>
-          </w:tcPr>
-          <w:p>
-            <w:pPr>
-              <w:jc w:val="left"/>
-            </w:pPr>
-            <w:r>
-              <w:rPr>
-                <w:b/>
-                <w:bCs/>
-                <w:i w:val="false"/>
-                <w:iCs w:val="false"/>
-                <w:color w:val="1c3a5e"/>
+            <w:shd w:fill="E3F1F1" w:color="auto" w:val="clear"/>
+            <w:tcMar>
+              <w:top w:type="dxa" w:w="100"/>
+              <w:left w:type="dxa" w:w="120"/>
+              <w:bottom w:type="dxa" w:w="100"/>
+              <w:right w:type="dxa" w:w="120"/>
+            </w:tcMar>
+            <w:vAlign w:val="center"/>
+          </w:tcPr>
+          <w:p>
+            <w:pPr>
+              <w:jc w:val="left"/>
+            </w:pPr>
+            <w:r>
+              <w:rPr>
+                <w:b/>
+                <w:bCs/>
+                <w:i w:val="false"/>
+                <w:iCs w:val="false"/>
+                <w:color w:val="0A3437"/>
                 <w:sz w:val="19"/>
                 <w:szCs w:val="19"/>
               </w:rPr>
@@ -979,26 +1001,26 @@
         <w:tc>
           <w:tcPr>
             <w:tcW w:type="dxa" w:w="2200"/>
-            <w:shd w:fill="eaf1fb" w:color="auto" w:val="clear"/>
-            <w:tcMar>
-              <w:top w:type="dxa" w:w="100"/>
-              <w:left w:type="dxa" w:w="120"/>
-              <w:bottom w:type="dxa" w:w="100"/>
-              <w:right w:type="dxa" w:w="120"/>
-            </w:tcMar>
-            <w:vAlign w:val="center"/>
-          </w:tcPr>
-          <w:p>
-            <w:pPr>
-              <w:jc w:val="left"/>
-            </w:pPr>
-            <w:r>
-              <w:rPr>
-                <w:b/>
-                <w:bCs/>
-                <w:i w:val="false"/>
-                <w:iCs w:val="false"/>
-                <w:color w:val="1c3a5e"/>
+            <w:shd w:fill="E3F1F1" w:color="auto" w:val="clear"/>
+            <w:tcMar>
+              <w:top w:type="dxa" w:w="100"/>
+              <w:left w:type="dxa" w:w="120"/>
+              <w:bottom w:type="dxa" w:w="100"/>
+              <w:right w:type="dxa" w:w="120"/>
+            </w:tcMar>
+            <w:vAlign w:val="center"/>
+          </w:tcPr>
+          <w:p>
+            <w:pPr>
+              <w:jc w:val="left"/>
+            </w:pPr>
+            <w:r>
+              <w:rPr>
+                <w:b/>
+                <w:bCs/>
+                <w:i w:val="false"/>
+                <w:iCs w:val="false"/>
+                <w:color w:val="0A3437"/>
                 <w:sz w:val="19"/>
                 <w:szCs w:val="19"/>
               </w:rPr>
@@ -1031,7 +1053,7 @@
                 <w:sz w:val="19"/>
                 <w:szCs w:val="19"/>
               </w:rPr>
-              <w:t xml:space="preserve">Aligned with the NMC Code: prioritise people, practise effectively, preserve safety, promote professionalism and trust.</w:t>
+              <w:t xml:space="preserve">Aligned with the NMC Code (2018): prioritise people, practise effectively, preserve safety, promote professionalism and trust.</w:t>
             </w:r>
           </w:p>
         </w:tc>
@@ -1040,26 +1062,26 @@
         <w:tc>
           <w:tcPr>
             <w:tcW w:type="dxa" w:w="2200"/>
-            <w:shd w:fill="eaf1fb" w:color="auto" w:val="clear"/>
-            <w:tcMar>
-              <w:top w:type="dxa" w:w="100"/>
-              <w:left w:type="dxa" w:w="120"/>
-              <w:bottom w:type="dxa" w:w="100"/>
-              <w:right w:type="dxa" w:w="120"/>
-            </w:tcMar>
-            <w:vAlign w:val="center"/>
-          </w:tcPr>
-          <w:p>
-            <w:pPr>
-              <w:jc w:val="left"/>
-            </w:pPr>
-            <w:r>
-              <w:rPr>
-                <w:b/>
-                <w:bCs/>
-                <w:i w:val="false"/>
-                <w:iCs w:val="false"/>
-                <w:color w:val="1c3a5e"/>
+            <w:shd w:fill="E3F1F1" w:color="auto" w:val="clear"/>
+            <w:tcMar>
+              <w:top w:type="dxa" w:w="100"/>
+              <w:left w:type="dxa" w:w="120"/>
+              <w:bottom w:type="dxa" w:w="100"/>
+              <w:right w:type="dxa" w:w="120"/>
+            </w:tcMar>
+            <w:vAlign w:val="center"/>
+          </w:tcPr>
+          <w:p>
+            <w:pPr>
+              <w:jc w:val="left"/>
+            </w:pPr>
+            <w:r>
+              <w:rPr>
+                <w:b/>
+                <w:bCs/>
+                <w:i w:val="false"/>
+                <w:iCs w:val="false"/>
+                <w:color w:val="0A3437"/>
                 <w:sz w:val="19"/>
                 <w:szCs w:val="19"/>
               </w:rPr>
@@ -1101,26 +1123,26 @@
         <w:tc>
           <w:tcPr>
             <w:tcW w:type="dxa" w:w="2200"/>
-            <w:shd w:fill="eaf1fb" w:color="auto" w:val="clear"/>
-            <w:tcMar>
-              <w:top w:type="dxa" w:w="100"/>
-              <w:left w:type="dxa" w:w="120"/>
-              <w:bottom w:type="dxa" w:w="100"/>
-              <w:right w:type="dxa" w:w="120"/>
-            </w:tcMar>
-            <w:vAlign w:val="center"/>
-          </w:tcPr>
-          <w:p>
-            <w:pPr>
-              <w:jc w:val="left"/>
-            </w:pPr>
-            <w:r>
-              <w:rPr>
-                <w:b/>
-                <w:bCs/>
-                <w:i w:val="false"/>
-                <w:iCs w:val="false"/>
-                <w:color w:val="1c3a5e"/>
+            <w:shd w:fill="E3F1F1" w:color="auto" w:val="clear"/>
+            <w:tcMar>
+              <w:top w:type="dxa" w:w="100"/>
+              <w:left w:type="dxa" w:w="120"/>
+              <w:bottom w:type="dxa" w:w="100"/>
+              <w:right w:type="dxa" w:w="120"/>
+            </w:tcMar>
+            <w:vAlign w:val="center"/>
+          </w:tcPr>
+          <w:p>
+            <w:pPr>
+              <w:jc w:val="left"/>
+            </w:pPr>
+            <w:r>
+              <w:rPr>
+                <w:b/>
+                <w:bCs/>
+                <w:i w:val="false"/>
+                <w:iCs w:val="false"/>
+                <w:color w:val="0A3437"/>
                 <w:sz w:val="19"/>
                 <w:szCs w:val="19"/>
               </w:rPr>
@@ -1162,26 +1184,26 @@
         <w:tc>
           <w:tcPr>
             <w:tcW w:type="dxa" w:w="2200"/>
-            <w:shd w:fill="eaf1fb" w:color="auto" w:val="clear"/>
-            <w:tcMar>
-              <w:top w:type="dxa" w:w="100"/>
-              <w:left w:type="dxa" w:w="120"/>
-              <w:bottom w:type="dxa" w:w="100"/>
-              <w:right w:type="dxa" w:w="120"/>
-            </w:tcMar>
-            <w:vAlign w:val="center"/>
-          </w:tcPr>
-          <w:p>
-            <w:pPr>
-              <w:jc w:val="left"/>
-            </w:pPr>
-            <w:r>
-              <w:rPr>
-                <w:b/>
-                <w:bCs/>
-                <w:i w:val="false"/>
-                <w:iCs w:val="false"/>
-                <w:color w:val="1c3a5e"/>
+            <w:shd w:fill="E3F1F1" w:color="auto" w:val="clear"/>
+            <w:tcMar>
+              <w:top w:type="dxa" w:w="100"/>
+              <w:left w:type="dxa" w:w="120"/>
+              <w:bottom w:type="dxa" w:w="100"/>
+              <w:right w:type="dxa" w:w="120"/>
+            </w:tcMar>
+            <w:vAlign w:val="center"/>
+          </w:tcPr>
+          <w:p>
+            <w:pPr>
+              <w:jc w:val="left"/>
+            </w:pPr>
+            <w:r>
+              <w:rPr>
+                <w:b/>
+                <w:bCs/>
+                <w:i w:val="false"/>
+                <w:iCs w:val="false"/>
+                <w:color w:val="0A3437"/>
                 <w:sz w:val="19"/>
                 <w:szCs w:val="19"/>
               </w:rPr>
@@ -1223,26 +1245,26 @@
         <w:tc>
           <w:tcPr>
             <w:tcW w:type="dxa" w:w="2200"/>
-            <w:shd w:fill="eaf1fb" w:color="auto" w:val="clear"/>
-            <w:tcMar>
-              <w:top w:type="dxa" w:w="100"/>
-              <w:left w:type="dxa" w:w="120"/>
-              <w:bottom w:type="dxa" w:w="100"/>
-              <w:right w:type="dxa" w:w="120"/>
-            </w:tcMar>
-            <w:vAlign w:val="center"/>
-          </w:tcPr>
-          <w:p>
-            <w:pPr>
-              <w:jc w:val="left"/>
-            </w:pPr>
-            <w:r>
-              <w:rPr>
-                <w:b/>
-                <w:bCs/>
-                <w:i w:val="false"/>
-                <w:iCs w:val="false"/>
-                <w:color w:val="1c3a5e"/>
+            <w:shd w:fill="E3F1F1" w:color="auto" w:val="clear"/>
+            <w:tcMar>
+              <w:top w:type="dxa" w:w="100"/>
+              <w:left w:type="dxa" w:w="120"/>
+              <w:bottom w:type="dxa" w:w="100"/>
+              <w:right w:type="dxa" w:w="120"/>
+            </w:tcMar>
+            <w:vAlign w:val="center"/>
+          </w:tcPr>
+          <w:p>
+            <w:pPr>
+              <w:jc w:val="left"/>
+            </w:pPr>
+            <w:r>
+              <w:rPr>
+                <w:b/>
+                <w:bCs/>
+                <w:i w:val="false"/>
+                <w:iCs w:val="false"/>
+                <w:color w:val="0A3437"/>
                 <w:sz w:val="19"/>
                 <w:szCs w:val="19"/>
               </w:rPr>
@@ -1284,26 +1306,26 @@
         <w:tc>
           <w:tcPr>
             <w:tcW w:type="dxa" w:w="2200"/>
-            <w:shd w:fill="eaf1fb" w:color="auto" w:val="clear"/>
-            <w:tcMar>
-              <w:top w:type="dxa" w:w="100"/>
-              <w:left w:type="dxa" w:w="120"/>
-              <w:bottom w:type="dxa" w:w="100"/>
-              <w:right w:type="dxa" w:w="120"/>
-            </w:tcMar>
-            <w:vAlign w:val="center"/>
-          </w:tcPr>
-          <w:p>
-            <w:pPr>
-              <w:jc w:val="left"/>
-            </w:pPr>
-            <w:r>
-              <w:rPr>
-                <w:b/>
-                <w:bCs/>
-                <w:i w:val="false"/>
-                <w:iCs w:val="false"/>
-                <w:color w:val="1c3a5e"/>
+            <w:shd w:fill="E3F1F1" w:color="auto" w:val="clear"/>
+            <w:tcMar>
+              <w:top w:type="dxa" w:w="100"/>
+              <w:left w:type="dxa" w:w="120"/>
+              <w:bottom w:type="dxa" w:w="100"/>
+              <w:right w:type="dxa" w:w="120"/>
+            </w:tcMar>
+            <w:vAlign w:val="center"/>
+          </w:tcPr>
+          <w:p>
+            <w:pPr>
+              <w:jc w:val="left"/>
+            </w:pPr>
+            <w:r>
+              <w:rPr>
+                <w:b/>
+                <w:bCs/>
+                <w:i w:val="false"/>
+                <w:iCs w:val="false"/>
+                <w:color w:val="0A3437"/>
                 <w:sz w:val="19"/>
                 <w:szCs w:val="19"/>
               </w:rPr>
@@ -1345,26 +1367,26 @@
         <w:tc>
           <w:tcPr>
             <w:tcW w:type="dxa" w:w="2200"/>
-            <w:shd w:fill="eaf1fb" w:color="auto" w:val="clear"/>
-            <w:tcMar>
-              <w:top w:type="dxa" w:w="100"/>
-              <w:left w:type="dxa" w:w="120"/>
-              <w:bottom w:type="dxa" w:w="100"/>
-              <w:right w:type="dxa" w:w="120"/>
-            </w:tcMar>
-            <w:vAlign w:val="center"/>
-          </w:tcPr>
-          <w:p>
-            <w:pPr>
-              <w:jc w:val="left"/>
-            </w:pPr>
-            <w:r>
-              <w:rPr>
-                <w:b/>
-                <w:bCs/>
-                <w:i w:val="false"/>
-                <w:iCs w:val="false"/>
-                <w:color w:val="1c3a5e"/>
+            <w:shd w:fill="E3F1F1" w:color="auto" w:val="clear"/>
+            <w:tcMar>
+              <w:top w:type="dxa" w:w="100"/>
+              <w:left w:type="dxa" w:w="120"/>
+              <w:bottom w:type="dxa" w:w="100"/>
+              <w:right w:type="dxa" w:w="120"/>
+            </w:tcMar>
+            <w:vAlign w:val="center"/>
+          </w:tcPr>
+          <w:p>
+            <w:pPr>
+              <w:jc w:val="left"/>
+            </w:pPr>
+            <w:r>
+              <w:rPr>
+                <w:b/>
+                <w:bCs/>
+                <w:i w:val="false"/>
+                <w:iCs w:val="false"/>
+                <w:color w:val="0A3437"/>
                 <w:sz w:val="19"/>
                 <w:szCs w:val="19"/>
               </w:rPr>
@@ -1406,26 +1428,26 @@
         <w:tc>
           <w:tcPr>
             <w:tcW w:type="dxa" w:w="2200"/>
-            <w:shd w:fill="eaf1fb" w:color="auto" w:val="clear"/>
-            <w:tcMar>
-              <w:top w:type="dxa" w:w="100"/>
-              <w:left w:type="dxa" w:w="120"/>
-              <w:bottom w:type="dxa" w:w="100"/>
-              <w:right w:type="dxa" w:w="120"/>
-            </w:tcMar>
-            <w:vAlign w:val="center"/>
-          </w:tcPr>
-          <w:p>
-            <w:pPr>
-              <w:jc w:val="left"/>
-            </w:pPr>
-            <w:r>
-              <w:rPr>
-                <w:b/>
-                <w:bCs/>
-                <w:i w:val="false"/>
-                <w:iCs w:val="false"/>
-                <w:color w:val="1c3a5e"/>
+            <w:shd w:fill="E3F1F1" w:color="auto" w:val="clear"/>
+            <w:tcMar>
+              <w:top w:type="dxa" w:w="100"/>
+              <w:left w:type="dxa" w:w="120"/>
+              <w:bottom w:type="dxa" w:w="100"/>
+              <w:right w:type="dxa" w:w="120"/>
+            </w:tcMar>
+            <w:vAlign w:val="center"/>
+          </w:tcPr>
+          <w:p>
+            <w:pPr>
+              <w:jc w:val="left"/>
+            </w:pPr>
+            <w:r>
+              <w:rPr>
+                <w:b/>
+                <w:bCs/>
+                <w:i w:val="false"/>
+                <w:iCs w:val="false"/>
+                <w:color w:val="0A3437"/>
                 <w:sz w:val="19"/>
                 <w:szCs w:val="19"/>
               </w:rPr>
@@ -1458,7 +1480,68 @@
                 <w:sz w:val="19"/>
                 <w:szCs w:val="19"/>
               </w:rPr>
-              <w:t xml:space="preserve">NHS England's Accessible Information Standard — identifying, recording and meeting people's communication and information needs.</w:t>
+              <w:t xml:space="preserve">NHS Accessible Information Standard (DCB1605) and Equality Act 2010 reasonable adjustments duty; underpinned by the Health and Social Care Act 2008 (Regulated Activities) Regulations 2014 and CQC Fundamental Standards.</w:t>
+            </w:r>
+          </w:p>
+        </w:tc>
+      </w:tr>
+      <w:tr>
+        <w:tc>
+          <w:tcPr>
+            <w:tcW w:type="dxa" w:w="2200"/>
+            <w:shd w:fill="E3F1F1" w:color="auto" w:val="clear"/>
+            <w:tcMar>
+              <w:top w:type="dxa" w:w="100"/>
+              <w:left w:type="dxa" w:w="120"/>
+              <w:bottom w:type="dxa" w:w="100"/>
+              <w:right w:type="dxa" w:w="120"/>
+            </w:tcMar>
+            <w:vAlign w:val="center"/>
+          </w:tcPr>
+          <w:p>
+            <w:pPr>
+              <w:jc w:val="left"/>
+            </w:pPr>
+            <w:r>
+              <w:rPr>
+                <w:b/>
+                <w:bCs/>
+                <w:i w:val="false"/>
+                <w:iCs w:val="false"/>
+                <w:color w:val="0A3437"/>
+                <w:sz w:val="19"/>
+                <w:szCs w:val="19"/>
+              </w:rPr>
+              <w:t xml:space="preserve">Consent and capacity</w:t>
+            </w:r>
+          </w:p>
+        </w:tc>
+        <w:tc>
+          <w:tcPr>
+            <w:tcW w:type="dxa" w:w="6826"/>
+            <w:tcMar>
+              <w:top w:type="dxa" w:w="100"/>
+              <w:left w:type="dxa" w:w="120"/>
+              <w:bottom w:type="dxa" w:w="100"/>
+              <w:right w:type="dxa" w:w="120"/>
+            </w:tcMar>
+            <w:vAlign w:val="center"/>
+          </w:tcPr>
+          <w:p>
+            <w:pPr>
+              <w:jc w:val="left"/>
+            </w:pPr>
+            <w:r>
+              <w:rPr>
+                <w:b w:val="false"/>
+                <w:bCs w:val="false"/>
+                <w:i w:val="false"/>
+                <w:iCs w:val="false"/>
+                <w:color w:val="0b0b0b"/>
+                <w:sz w:val="19"/>
+                <w:szCs w:val="19"/>
+              </w:rPr>
+              <w:t xml:space="preserve">Consent obtained per the service's Consent Policy; capacity assessed using the Mental Capacity Act 2005 and Gillick competency principles.</w:t>
             </w:r>
           </w:p>
         </w:tc>

</xml_diff>